<commit_message>
feat: trim page copy for a cleaner platform demo
精简页面文案（#26）：演示时页面干净、像完整平台，方法学说明不删除而是折叠。
- 首页改为平台首页：定位一句、注册/登录或“进入今日任务”、四个核心功能卡片、课程实验入口
- 概览、今日任务、复习、词表、实验三、实验四：去掉长段说明，统计卡片副文字缩短；
  分母、时区、复习规则、“不是掌握度/置信度”、推理留证等收进页面底部默认折叠的“说明”
- 结果区不再显示 request_id 与长版本串（接口与数据库保留）；实验三结果显示为百分比
- 复习页下一项到期改为“约 N 分钟后”，不再显示 UTC 时间串；修正 /lab/hello 过时图注
- 截图重新生成（实验三截图展开离线评测），四份报告与幻灯片配图同步

Co-Authored-By: Claude Opus 5.5 <noreply@anthropic.com>
</commit_message>
<xml_diff>
--- a/docs/reports/实验三_案例数据分析（机器学习）.docx
+++ b/docs/reports/实验三_案例数据分析（机器学习）.docx
@@ -7982,7 +7982,7 @@
             <w:r>
               <w:drawing>
                 <wp:inline distT="0" distB="0" distL="0" distR="0">
-                  <wp:extent cx="5016500" cy="5545583"/>
+                  <wp:extent cx="5016500" cy="5529907"/>
                   <wp:docPr id="5001" name="e3_ml.png"/>
                   <wp:cNvGraphicFramePr>
                     <a:graphicFrameLocks xmlns:a="http://schemas.openxmlformats.org/drawingml/2006/main" noChangeAspect="1"/>
@@ -8003,7 +8003,7 @@
                         <pic:spPr>
                           <a:xfrm>
                             <a:off x="0" y="0"/>
-                            <a:ext cx="5016500" cy="5545583"/>
+                            <a:ext cx="5016500" cy="5529907"/>
                           </a:xfrm>
                           <a:prstGeom prst="rect">
                             <a:avLst/>

</xml_diff>

<commit_message>
feat: trim page copy for a cleaner platform demo (#27)
精简页面文案（#26）：演示时页面干净、像完整平台，方法学说明不删除而是折叠。
- 首页改为平台首页：定位、注册/登录或今日任务入口、核心功能卡片、课程实验入口
- 各学习页与实验页去掉长段说明；分母、时区、复习规则、“不是掌握度/置信度”、推理留证收进折叠说明
- 结果区不再显示 request_id；实验三结果显示为百分比；复习页到期时间改为相对时间
- 截图、四份报告与幻灯片配图同步

Co-Authored-By: Claude Opus 5.5 <noreply@anthropic.com>
</commit_message>
<xml_diff>
--- a/docs/reports/实验三_案例数据分析（机器学习）.docx
+++ b/docs/reports/实验三_案例数据分析（机器学习）.docx
@@ -7982,7 +7982,7 @@
             <w:r>
               <w:drawing>
                 <wp:inline distT="0" distB="0" distL="0" distR="0">
-                  <wp:extent cx="5016500" cy="5545583"/>
+                  <wp:extent cx="5016500" cy="5529907"/>
                   <wp:docPr id="5001" name="e3_ml.png"/>
                   <wp:cNvGraphicFramePr>
                     <a:graphicFrameLocks xmlns:a="http://schemas.openxmlformats.org/drawingml/2006/main" noChangeAspect="1"/>
@@ -8003,7 +8003,7 @@
                         <pic:spPr>
                           <a:xfrm>
                             <a:off x="0" y="0"/>
-                            <a:ext cx="5016500" cy="5545583"/>
+                            <a:ext cx="5016500" cy="5529907"/>
                           </a:xfrm>
                           <a:prstGeom prst="rect">
                             <a:avLst/>

</xml_diff>